<commit_message>
finished analysis, advice, design, realization. WOrking on the verification and validation, which is also almost finished. Didnt upload for a week, because i forgor
</commit_message>
<xml_diff>
--- a/doc/planning/Greenhouse_Project_Plan.docx
+++ b/doc/planning/Greenhouse_Project_Plan.docx
@@ -45,6 +45,156 @@
         <w:rPr/>
       </w:r>
     </w:p>
+    <w:p>
+      <w:pPr>
+        <w:pStyle w:val="Normal"/>
+        <w:rPr/>
+      </w:pPr>
+      <w:r>
+        <w:rPr/>
+      </w:r>
+    </w:p>
+    <w:sdt>
+      <w:sdtPr>
+        <w:docPartObj>
+          <w:docPartGallery w:val="Table of Contents"/>
+          <w:docPartUnique w:val="true"/>
+        </w:docPartObj>
+      </w:sdtPr>
+      <w:sdtContent>
+        <w:p>
+          <w:pPr>
+            <w:pStyle w:val="TOCHeading"/>
+            <w:rPr/>
+          </w:pPr>
+          <w:r>
+            <w:rPr/>
+            <w:t>Table of Contents</w:t>
+          </w:r>
+        </w:p>
+        <w:p>
+          <w:pPr>
+            <w:pStyle w:val="TOC1"/>
+            <w:tabs>
+              <w:tab w:val="clear" w:pos="13968"/>
+              <w:tab w:val="right" w:pos="13860" w:leader="dot"/>
+            </w:tabs>
+            <w:rPr/>
+          </w:pPr>
+          <w:r>
+            <w:fldChar w:fldCharType="begin"/>
+          </w:r>
+          <w:r>
+            <w:rPr>
+              <w:rStyle w:val="IndexLink"/>
+            </w:rPr>
+            <w:instrText xml:space="preserve"> TOC \f \o "1-9" \h</w:instrText>
+          </w:r>
+          <w:r>
+            <w:rPr>
+              <w:rStyle w:val="IndexLink"/>
+            </w:rPr>
+            <w:fldChar w:fldCharType="separate"/>
+          </w:r>
+          <w:hyperlink w:anchor="__RefHeading___Toc127_2373205440" w:tooltip="1. Waterfall approach">
+            <w:r>
+              <w:rPr>
+                <w:rStyle w:val="IndexLink"/>
+              </w:rPr>
+              <w:t>1. Waterfall approach</w:t>
+              <w:tab/>
+              <w:t>2</w:t>
+            </w:r>
+          </w:hyperlink>
+        </w:p>
+        <w:p>
+          <w:pPr>
+            <w:pStyle w:val="TOC1"/>
+            <w:tabs>
+              <w:tab w:val="clear" w:pos="13968"/>
+              <w:tab w:val="right" w:pos="13860" w:leader="dot"/>
+            </w:tabs>
+            <w:rPr/>
+          </w:pPr>
+          <w:hyperlink w:anchor="__RefHeading___Toc129_2373205440" w:tooltip="2. Weekly milestones">
+            <w:r>
+              <w:rPr>
+                <w:rStyle w:val="IndexLink"/>
+              </w:rPr>
+              <w:t>2. Weekly milestones</w:t>
+              <w:tab/>
+              <w:t>2</w:t>
+            </w:r>
+          </w:hyperlink>
+        </w:p>
+        <w:p>
+          <w:pPr>
+            <w:pStyle w:val="TOC1"/>
+            <w:tabs>
+              <w:tab w:val="clear" w:pos="13968"/>
+              <w:tab w:val="right" w:pos="13860" w:leader="dot"/>
+            </w:tabs>
+            <w:rPr/>
+          </w:pPr>
+          <w:hyperlink w:anchor="__RefHeading___Toc131_2373205440" w:tooltip="3. What depends on what">
+            <w:r>
+              <w:rPr>
+                <w:rStyle w:val="IndexLink"/>
+              </w:rPr>
+              <w:t>3. What depends on what</w:t>
+              <w:tab/>
+              <w:t>3</w:t>
+            </w:r>
+          </w:hyperlink>
+        </w:p>
+        <w:p>
+          <w:pPr>
+            <w:pStyle w:val="TOC1"/>
+            <w:tabs>
+              <w:tab w:val="clear" w:pos="13968"/>
+              <w:tab w:val="right" w:pos="13860" w:leader="dot"/>
+            </w:tabs>
+            <w:rPr/>
+          </w:pPr>
+          <w:hyperlink w:anchor="__RefHeading___Toc133_2373205440" w:tooltip="4. How I will handle delays">
+            <w:r>
+              <w:rPr>
+                <w:rStyle w:val="IndexLink"/>
+              </w:rPr>
+              <w:t>4. How I will handle delays</w:t>
+              <w:tab/>
+              <w:t>3</w:t>
+            </w:r>
+          </w:hyperlink>
+        </w:p>
+        <w:p>
+          <w:pPr>
+            <w:pStyle w:val="TOC1"/>
+            <w:tabs>
+              <w:tab w:val="clear" w:pos="13968"/>
+              <w:tab w:val="right" w:pos="13860" w:leader="dot"/>
+            </w:tabs>
+            <w:rPr/>
+          </w:pPr>
+          <w:hyperlink w:anchor="__RefHeading___Toc135_2373205440" w:tooltip="5. Detailed schedule – Gantt Chart">
+            <w:r>
+              <w:rPr>
+                <w:rStyle w:val="IndexLink"/>
+              </w:rPr>
+              <w:t>5. Detailed schedule – Gantt Chart</w:t>
+              <w:tab/>
+              <w:t>4</w:t>
+            </w:r>
+          </w:hyperlink>
+          <w:r>
+            <w:rPr>
+              <w:rStyle w:val="IndexLink"/>
+            </w:rPr>
+            <w:fldChar w:fldCharType="end"/>
+          </w:r>
+        </w:p>
+      </w:sdtContent>
+    </w:sdt>
     <w:p>
       <w:pPr>
         <w:pStyle w:val="Heading1"/>
@@ -58,152 +208,6 @@
       </w:pPr>
       <w:r>
         <w:rPr/>
-        <w:t>Table of Contents</w:t>
-      </w:r>
-    </w:p>
-    <w:p>
-      <w:pPr>
-        <w:pStyle w:val="Normal"/>
-        <w:widowControl/>
-        <w:tabs>
-          <w:tab w:val="clear" w:pos="720"/>
-          <w:tab w:val="right" w:pos="13824" w:leader="dot"/>
-        </w:tabs>
-        <w:suppressAutoHyphens w:val="true"/>
-        <w:bidi w:val="0"/>
-        <w:spacing w:lineRule="auto" w:line="252" w:before="0" w:after="300"/>
-        <w:ind w:hanging="0" w:start="0" w:end="0"/>
-        <w:jc w:val="start"/>
-        <w:rPr/>
-      </w:pPr>
-      <w:hyperlink w:anchor="plan_section_1">
-        <w:r>
-          <w:rPr>
-            <w:rStyle w:val="Style"/>
-          </w:rPr>
-          <w:t>1. Waterfall approach</w:t>
-        </w:r>
-      </w:hyperlink>
-      <w:r>
-        <w:rPr/>
-        <w:tab/>
-        <w:t>2</w:t>
-      </w:r>
-    </w:p>
-    <w:p>
-      <w:pPr>
-        <w:pStyle w:val="Normal"/>
-        <w:widowControl/>
-        <w:tabs>
-          <w:tab w:val="clear" w:pos="720"/>
-          <w:tab w:val="right" w:pos="13824" w:leader="dot"/>
-        </w:tabs>
-        <w:suppressAutoHyphens w:val="true"/>
-        <w:bidi w:val="0"/>
-        <w:spacing w:lineRule="auto" w:line="252" w:before="0" w:after="300"/>
-        <w:ind w:hanging="0" w:start="0" w:end="0"/>
-        <w:jc w:val="start"/>
-        <w:rPr/>
-      </w:pPr>
-      <w:hyperlink w:anchor="plan_section_2">
-        <w:r>
-          <w:rPr>
-            <w:rStyle w:val="Style"/>
-          </w:rPr>
-          <w:t>2. Weekly milestones</w:t>
-        </w:r>
-      </w:hyperlink>
-      <w:r>
-        <w:rPr/>
-        <w:tab/>
-        <w:t>2</w:t>
-      </w:r>
-    </w:p>
-    <w:p>
-      <w:pPr>
-        <w:pStyle w:val="Normal"/>
-        <w:widowControl/>
-        <w:tabs>
-          <w:tab w:val="clear" w:pos="720"/>
-          <w:tab w:val="right" w:pos="13824" w:leader="dot"/>
-        </w:tabs>
-        <w:suppressAutoHyphens w:val="true"/>
-        <w:bidi w:val="0"/>
-        <w:spacing w:lineRule="auto" w:line="252" w:before="0" w:after="300"/>
-        <w:ind w:hanging="0" w:start="0" w:end="0"/>
-        <w:jc w:val="start"/>
-        <w:rPr/>
-      </w:pPr>
-      <w:hyperlink w:anchor="plan_section_3">
-        <w:r>
-          <w:rPr>
-            <w:rStyle w:val="Style"/>
-          </w:rPr>
-          <w:t>3. What depends on what</w:t>
-        </w:r>
-      </w:hyperlink>
-      <w:r>
-        <w:rPr/>
-        <w:tab/>
-        <w:t>3</w:t>
-      </w:r>
-    </w:p>
-    <w:p>
-      <w:pPr>
-        <w:pStyle w:val="Normal"/>
-        <w:widowControl/>
-        <w:tabs>
-          <w:tab w:val="clear" w:pos="720"/>
-          <w:tab w:val="right" w:pos="13824" w:leader="dot"/>
-        </w:tabs>
-        <w:suppressAutoHyphens w:val="true"/>
-        <w:bidi w:val="0"/>
-        <w:spacing w:lineRule="auto" w:line="252" w:before="0" w:after="300"/>
-        <w:ind w:hanging="0" w:start="0" w:end="0"/>
-        <w:jc w:val="start"/>
-        <w:rPr/>
-      </w:pPr>
-      <w:hyperlink w:anchor="plan_section_4">
-        <w:r>
-          <w:rPr>
-            <w:rStyle w:val="Style"/>
-          </w:rPr>
-          <w:t>4. How I will handle delays</w:t>
-        </w:r>
-      </w:hyperlink>
-      <w:r>
-        <w:rPr/>
-        <w:tab/>
-        <w:t>3</w:t>
-      </w:r>
-    </w:p>
-    <w:p>
-      <w:pPr>
-        <w:pStyle w:val="Normal"/>
-        <w:widowControl/>
-        <w:tabs>
-          <w:tab w:val="clear" w:pos="720"/>
-          <w:tab w:val="right" w:pos="13824" w:leader="dot"/>
-        </w:tabs>
-        <w:suppressAutoHyphens w:val="true"/>
-        <w:bidi w:val="0"/>
-        <w:spacing w:lineRule="auto" w:line="252" w:before="0" w:after="300"/>
-        <w:ind w:hanging="0" w:start="0" w:end="0"/>
-        <w:jc w:val="start"/>
-        <w:rPr/>
-      </w:pPr>
-      <w:hyperlink w:anchor="plan_section_5">
-        <w:r>
-          <w:rPr>
-            <w:rStyle w:val="Style"/>
-          </w:rPr>
-          <w:t>5. Detailed schedule</w:t>
-        </w:r>
-      </w:hyperlink>
-      <w:r>
-        <w:rPr/>
-        <w:tab/>
-        <w:t>4</w:t>
       </w:r>
       <w:r>
         <w:br w:type="page"/>
@@ -212,14 +216,17 @@
     <w:p>
       <w:pPr>
         <w:pStyle w:val="Heading1"/>
+        <w:spacing w:before="0" w:after="120"/>
         <w:rPr/>
       </w:pPr>
+      <w:bookmarkStart w:id="0" w:name="__RefHeading___Toc127_2373205440"/>
+      <w:bookmarkEnd w:id="0"/>
       <w:r>
         <w:rPr/>
         <w:t>1. Waterfall approach</w:t>
       </w:r>
-      <w:bookmarkStart w:id="0" w:name="plan_section_1"/>
-      <w:bookmarkEnd w:id="0"/>
+      <w:bookmarkStart w:id="1" w:name="plan_section_1"/>
+      <w:bookmarkEnd w:id="1"/>
     </w:p>
     <w:p>
       <w:pPr>
@@ -295,10 +302,30 @@
       </w:pPr>
       <w:r>
         <w:rPr/>
+      </w:r>
+    </w:p>
+    <w:p>
+      <w:pPr>
+        <w:pStyle w:val="Heading1"/>
+        <w:rPr/>
+      </w:pPr>
+      <w:r>
+        <w:rPr/>
+      </w:r>
+    </w:p>
+    <w:p>
+      <w:pPr>
+        <w:pStyle w:val="Heading1"/>
+        <w:rPr/>
+      </w:pPr>
+      <w:bookmarkStart w:id="2" w:name="__RefHeading___Toc129_2373205440"/>
+      <w:bookmarkEnd w:id="2"/>
+      <w:r>
+        <w:rPr/>
         <w:t>2. Weekly milestones</w:t>
       </w:r>
-      <w:bookmarkStart w:id="1" w:name="plan_section_2"/>
-      <w:bookmarkEnd w:id="1"/>
+      <w:bookmarkStart w:id="3" w:name="plan_section_2"/>
+      <w:bookmarkEnd w:id="3"/>
     </w:p>
     <w:tbl>
       <w:tblPr>
@@ -560,7 +587,6 @@
       </w:pPr>
       <w:r>
         <w:rPr/>
-        <w:t>At each week’s end, I will compare the working result with the milestone and update the remaining plan.</w:t>
       </w:r>
     </w:p>
     <w:p>
@@ -591,12 +617,14 @@
         <w:spacing w:before="0" w:after="120"/>
         <w:rPr/>
       </w:pPr>
+      <w:bookmarkStart w:id="4" w:name="__RefHeading___Toc131_2373205440"/>
+      <w:bookmarkEnd w:id="4"/>
       <w:r>
         <w:rPr/>
         <w:t>3. What depends on what</w:t>
       </w:r>
-      <w:bookmarkStart w:id="2" w:name="plan_section_3"/>
-      <w:bookmarkEnd w:id="2"/>
+      <w:bookmarkStart w:id="5" w:name="plan_section_3"/>
+      <w:bookmarkEnd w:id="5"/>
     </w:p>
     <w:p>
       <w:pPr>
@@ -682,10 +710,21 @@
       </w:pPr>
       <w:r>
         <w:rPr/>
+      </w:r>
+    </w:p>
+    <w:p>
+      <w:pPr>
+        <w:pStyle w:val="Heading1"/>
+        <w:rPr/>
+      </w:pPr>
+      <w:bookmarkStart w:id="6" w:name="__RefHeading___Toc133_2373205440"/>
+      <w:bookmarkEnd w:id="6"/>
+      <w:r>
+        <w:rPr/>
         <w:t>4. How I will handle delay</w:t>
       </w:r>
-      <w:bookmarkStart w:id="3" w:name="plan_section_4"/>
-      <w:bookmarkEnd w:id="3"/>
+      <w:bookmarkStart w:id="7" w:name="plan_section_4"/>
+      <w:bookmarkEnd w:id="7"/>
       <w:r>
         <w:rPr/>
         <w:t>s</w:t>
@@ -706,8 +745,8 @@
         <w:tblLook w:noHBand="0" w:noVBand="1" w:firstColumn="1" w:lastRow="0" w:lastColumn="0" w:firstRow="1" w:val="04a0"/>
       </w:tblPr>
       <w:tblGrid>
-        <w:gridCol w:w="4600"/>
-        <w:gridCol w:w="9367"/>
+        <w:gridCol w:w="4599"/>
+        <w:gridCol w:w="9368"/>
       </w:tblGrid>
       <w:tr>
         <w:trPr>
@@ -716,7 +755,7 @@
         </w:trPr>
         <w:tc>
           <w:tcPr>
-            <w:tcW w:w="4600" w:type="dxa"/>
+            <w:tcW w:w="4599" w:type="dxa"/>
             <w:tcBorders>
               <w:top w:val="single" w:sz="4" w:space="0" w:color="D9D9D9"/>
               <w:start w:val="single" w:sz="4" w:space="0" w:color="D9D9D9"/>
@@ -744,7 +783,7 @@
         </w:tc>
         <w:tc>
           <w:tcPr>
-            <w:tcW w:w="9367" w:type="dxa"/>
+            <w:tcW w:w="9368" w:type="dxa"/>
             <w:tcBorders>
               <w:top w:val="single" w:sz="4" w:space="0" w:color="D9D9D9"/>
               <w:start w:val="single" w:sz="4" w:space="0" w:color="D9D9D9"/>
@@ -777,7 +816,7 @@
         </w:trPr>
         <w:tc>
           <w:tcPr>
-            <w:tcW w:w="4600" w:type="dxa"/>
+            <w:tcW w:w="4599" w:type="dxa"/>
             <w:tcBorders>
               <w:top w:val="single" w:sz="4" w:space="0" w:color="D9D9D9"/>
               <w:start w:val="single" w:sz="4" w:space="0" w:color="D9D9D9"/>
@@ -804,7 +843,7 @@
         </w:tc>
         <w:tc>
           <w:tcPr>
-            <w:tcW w:w="9367" w:type="dxa"/>
+            <w:tcW w:w="9368" w:type="dxa"/>
             <w:tcBorders>
               <w:top w:val="single" w:sz="4" w:space="0" w:color="D9D9D9"/>
               <w:start w:val="single" w:sz="4" w:space="0" w:color="D9D9D9"/>
@@ -836,7 +875,7 @@
         </w:trPr>
         <w:tc>
           <w:tcPr>
-            <w:tcW w:w="4600" w:type="dxa"/>
+            <w:tcW w:w="4599" w:type="dxa"/>
             <w:tcBorders>
               <w:top w:val="single" w:sz="4" w:space="0" w:color="D9D9D9"/>
               <w:start w:val="single" w:sz="4" w:space="0" w:color="D9D9D9"/>
@@ -863,7 +902,7 @@
         </w:tc>
         <w:tc>
           <w:tcPr>
-            <w:tcW w:w="9367" w:type="dxa"/>
+            <w:tcW w:w="9368" w:type="dxa"/>
             <w:tcBorders>
               <w:top w:val="single" w:sz="4" w:space="0" w:color="D9D9D9"/>
               <w:start w:val="single" w:sz="4" w:space="0" w:color="D9D9D9"/>
@@ -895,7 +934,7 @@
         </w:trPr>
         <w:tc>
           <w:tcPr>
-            <w:tcW w:w="4600" w:type="dxa"/>
+            <w:tcW w:w="4599" w:type="dxa"/>
             <w:tcBorders>
               <w:top w:val="single" w:sz="4" w:space="0" w:color="D9D9D9"/>
               <w:start w:val="single" w:sz="4" w:space="0" w:color="D9D9D9"/>
@@ -922,7 +961,7 @@
         </w:tc>
         <w:tc>
           <w:tcPr>
-            <w:tcW w:w="9367" w:type="dxa"/>
+            <w:tcW w:w="9368" w:type="dxa"/>
             <w:tcBorders>
               <w:top w:val="single" w:sz="4" w:space="0" w:color="D9D9D9"/>
               <w:start w:val="single" w:sz="4" w:space="0" w:color="D9D9D9"/>
@@ -943,35 +982,7 @@
                 <w:b w:val="false"/>
                 <w:sz w:val="20"/>
               </w:rPr>
-              <w:t>Postpone “</w:t>
-            </w:r>
-            <w:r>
-              <w:rPr>
-                <w:b w:val="false"/>
-                <w:sz w:val="20"/>
-              </w:rPr>
-              <w:t>Could Have</w:t>
-            </w:r>
-            <w:r>
-              <w:rPr>
-                <w:b w:val="false"/>
-                <w:sz w:val="20"/>
-              </w:rPr>
-              <w:t xml:space="preserve">” </w:t>
-            </w:r>
-            <w:r>
-              <w:rPr>
-                <w:b w:val="false"/>
-                <w:sz w:val="20"/>
-              </w:rPr>
-              <w:t>requirements first, then “Should Have” if needed</w:t>
-            </w:r>
-            <w:r>
-              <w:rPr>
-                <w:b w:val="false"/>
-                <w:sz w:val="20"/>
-              </w:rPr>
-              <w:t>.</w:t>
+              <w:t>Postpone “Could Have” requirements first, then “Should Have” if needed.</w:t>
             </w:r>
           </w:p>
         </w:tc>
@@ -985,7 +996,6 @@
       </w:pPr>
       <w:r>
         <w:rPr/>
-        <w:t>I will update the schedule when tasks slip and record the reason for each change.</w:t>
       </w:r>
     </w:p>
     <w:p>
@@ -994,12 +1004,22 @@
         <w:spacing w:before="0" w:after="120"/>
         <w:rPr/>
       </w:pPr>
+      <w:bookmarkStart w:id="8" w:name="__RefHeading___Toc135_2373205440"/>
+      <w:bookmarkEnd w:id="8"/>
       <w:r>
         <w:rPr/>
         <w:t>5. Detailed schedule</w:t>
       </w:r>
-      <w:bookmarkStart w:id="4" w:name="plan_section_5"/>
-      <w:bookmarkEnd w:id="4"/>
+      <w:bookmarkStart w:id="9" w:name="plan_section_5"/>
+      <w:bookmarkEnd w:id="9"/>
+      <w:r>
+        <w:rPr/>
+        <w:t xml:space="preserve"> – </w:t>
+      </w:r>
+      <w:r>
+        <w:rPr/>
+        <w:t>Gantt Chart</w:t>
+      </w:r>
     </w:p>
     <w:p>
       <w:pPr>
@@ -1013,6 +1033,15 @@
     </w:p>
     <w:p>
       <w:pPr>
+        <w:pStyle w:val="Normal"/>
+        <w:rPr/>
+      </w:pPr>
+      <w:r>
+        <w:rPr/>
+      </w:r>
+    </w:p>
+    <w:p>
+      <w:pPr>
         <w:pStyle w:val="Heading2"/>
         <w:spacing w:before="1900" w:after="120"/>
         <w:jc w:val="center"/>
@@ -1020,12 +1049,58 @@
       </w:pPr>
       <w:r>
         <w:rPr/>
+        <w:drawing>
+          <wp:anchor distT="0" distB="0" distL="0" distR="0" simplePos="0" relativeHeight="4" behindDoc="0" locked="0" layoutInCell="0" allowOverlap="1">
+            <wp:simplePos x="0" y="0"/>
+            <wp:positionH relativeFrom="column">
+              <wp:align>center</wp:align>
+            </wp:positionH>
+            <wp:positionV relativeFrom="paragraph">
+              <wp:posOffset>635</wp:posOffset>
+            </wp:positionV>
+            <wp:extent cx="8801735" cy="3510915"/>
+            <wp:effectExtent l="0" t="0" r="0" b="0"/>
+            <wp:wrapSquare wrapText="largest"/>
+            <wp:docPr id="3" name="Image1"/>
+            <wp:cNvGraphicFramePr>
+              <a:graphicFrameLocks xmlns:a="http://schemas.openxmlformats.org/drawingml/2006/main" noChangeAspect="1"/>
+            </wp:cNvGraphicFramePr>
+            <a:graphic xmlns:a="http://schemas.openxmlformats.org/drawingml/2006/main">
+              <a:graphicData uri="http://schemas.openxmlformats.org/drawingml/2006/picture">
+                <pic:pic xmlns:pic="http://schemas.openxmlformats.org/drawingml/2006/picture">
+                  <pic:nvPicPr>
+                    <pic:cNvPr id="3" name="Image1"/>
+                    <pic:cNvPicPr>
+                      <a:picLocks noChangeAspect="1" noChangeArrowheads="1"/>
+                    </pic:cNvPicPr>
+                  </pic:nvPicPr>
+                  <pic:blipFill>
+                    <a:blip r:embed="rId4"/>
+                    <a:stretch>
+                      <a:fillRect/>
+                    </a:stretch>
+                  </pic:blipFill>
+                  <pic:spPr bwMode="auto">
+                    <a:xfrm>
+                      <a:off x="0" y="0"/>
+                      <a:ext cx="8801735" cy="3510915"/>
+                    </a:xfrm>
+                    <a:prstGeom prst="rect">
+                      <a:avLst/>
+                    </a:prstGeom>
+                    <a:noFill/>
+                  </pic:spPr>
+                </pic:pic>
+              </a:graphicData>
+            </a:graphic>
+          </wp:anchor>
+        </w:drawing>
       </w:r>
     </w:p>
     <w:sectPr>
-      <w:footerReference w:type="even" r:id="rId4"/>
-      <w:footerReference w:type="default" r:id="rId5"/>
-      <w:footerReference w:type="first" r:id="rId6"/>
+      <w:footerReference w:type="even" r:id="rId5"/>
+      <w:footerReference w:type="default" r:id="rId6"/>
+      <w:footerReference w:type="first" r:id="rId7"/>
       <w:type w:val="nextPage"/>
       <w:pgSz w:orient="landscape" w:w="15840" w:h="12240"/>
       <w:pgMar w:left="936" w:right="1043" w:gutter="0" w:header="0" w:top="792" w:footer="720" w:bottom="792"/>

</xml_diff>